<commit_message>
fix references: keep [2] Stetco, remove [3] de Jong, renumber + add links
Agent-Logs-Url: https://github.com/emirsecer1/turbine-gearbox-predictive-maintenance/sessions/c75e2573-ad80-4f8b-a0dd-d97509216bef

Co-authored-by: emirsecer1 <158167678+emirsecer1@users.noreply.github.com>
</commit_message>
<xml_diff>
--- a/report/IEEE_Report_Wind_Turbine_Predictive_Maintenance.docx
+++ b/report/IEEE_Report_Wind_Turbine_Predictive_Maintenance.docx
@@ -389,7 +389,7 @@
           <w:rFonts w:ascii="Times New Roman" w:hAnsi="Times New Roman"/>
           <w:sz w:val="18"/>
         </w:rPr>
-        <w:t>Titreşim analizi teknikleri, zaman alanı, frekans alanı ve zaman-frekans alanı olmak üzere üç ana kategoride incelenmektedir. Zaman alanı yöntemleri; RMS (Karekök Ortalama), tepe değeri, basıklık (kurtosis) ve çarpıklık gibi istatistiksel özellikler aracılığıyla sinyal karakteristiklerini özetlemektedir. Frekans alanı analizinde FFT ve güç spektral yoğunluğu (PSD) kullanılarak dişli çark mesh frekansı, rulman arıza frekansları (BPFO, BPFI, BSF) ve harmonikleri tespit edilmektedir. Zaman-frekans alanı yöntemleri ise Kısa Zamanlı Fourier Dönüşümü (STFT), Wavelet dönüşümü ve Hilbert-Huang dönüşümü gibi tekniklerle durağan olmayan sinyallerdeki geçici olayların tespitine olanak sağlamaktadır [15].</w:t>
+        <w:t>Titreşim analizi teknikleri, zaman alanı, frekans alanı ve zaman-frekans alanı olmak üzere üç ana kategoride incelenmektedir. Zaman alanı yöntemleri; RMS (Karekök Ortalama), tepe değeri, basıklık (kurtosis) ve çarpıklık gibi istatistiksel özellikler aracılığıyla sinyal karakteristiklerini özetlemektedir. Frekans alanı analizinde FFT ve güç spektral yoğunluğu (PSD) kullanılarak dişli çark mesh frekansı, rulman arıza frekansları (BPFO, BPFI, BSF) ve harmonikleri tespit edilmektedir. Zaman-frekans alanı yöntemleri ise Kısa Zamanlı Fourier Dönüşümü (STFT), Wavelet dönüşümü ve Hilbert-Huang dönüşümü gibi tekniklerle durağan olmayan sinyallerdeki geçici olayların tespitine olanak sağlamaktadır [14].</w:t>
       </w:r>
     </w:p>
     <w:p>
@@ -560,7 +560,7 @@
           <w:rFonts w:ascii="Times New Roman" w:hAnsi="Times New Roman"/>
           <w:sz w:val="18"/>
         </w:rPr>
-        <w:t>Bozulma (degradasyon) modelleme, KKÖ tahmini için temel bir yaklaşım olarak, bileşen sağlık durumunun zamana bağlı değişimini matematiksel olarak formüle etmektedir. Doğrusal ve üstel bozulma modelleri, Wiener ve Gamma süreçleri gibi stokastik modeller ile Bayesci güncelleme mekanizmaları bu alanda yaygın olarak kullanılmaktadır. Sağlık Göstergesi (HI) oluşturma, çok değişkenli sensör verilerini tek boyutlu bir bozulma eğrisine dönüştürerek KKÖ tahminini kolaylaştırmaktadır. PCA tabanlı ve öz-kodlayıcı (autoencoder) tabanlı sağlık göstergeleri, ham sensör verisinden daha tutarlı ve yorumlanabilir bozulma eğrileri üretmektedir [17].</w:t>
+        <w:t>Bozulma (degradasyon) modelleme, KKÖ tahmini için temel bir yaklaşım olarak, bileşen sağlık durumunun zamana bağlı değişimini matematiksel olarak formüle etmektedir. Doğrusal ve üstel bozulma modelleri, Wiener ve Gamma süreçleri gibi stokastik modeller ile Bayesci güncelleme mekanizmaları bu alanda yaygın olarak kullanılmaktadır. Sağlık Göstergesi (HI) oluşturma, çok değişkenli sensör verilerini tek boyutlu bir bozulma eğrisine dönüştürerek KKÖ tahminini kolaylaştırmaktadır. PCA tabanlı ve öz-kodlayıcı (autoencoder) tabanlı sağlık göstergeleri, ham sensör verisinden daha tutarlı ve yorumlanabilir bozulma eğrileri üretmektedir [16].</w:t>
       </w:r>
     </w:p>
     <w:p>
@@ -8289,8 +8289,19 @@
           <w:sz w:val="15"/>
           <w:u w:val="none"/>
         </w:rPr>
-        <w:t>[1] Y. Wang, X. Ma, P. Qian, "Wind turbine fault detection and identification through self-attention-based mechanism," Renewable Energy, vol. 211, pp. 918-937, 2023.</w:t>
+        <w:t>[1] T. Guo, H. Wang, J. Li, H. Wang, "Wind turbine fault detection and identification through self-attention-based mechanism embedded with a multivariable query pattern," Renewable Energy, vol. 211, pp. 918-937, 2023. (DOI: 10.1016/j.renene.2023.04.113)</w:t>
       </w:r>
+      <w:hyperlink r:id="rId42">
+        <w:r>
+          <w:rPr>
+            <w:rFonts w:ascii="Times New Roman" w:hAnsi="Times New Roman"/>
+            <w:sz w:val="15"/>
+            <w:color w:val="1155CC"/>
+            <w:u w:val="single"/>
+          </w:rPr>
+          <w:t xml:space="preserve"> https://doi.org/10.1016/j.renene.2023.04.113</w:t>
+        </w:r>
+      </w:hyperlink>
     </w:p>
     <w:p>
       <w:pPr>
@@ -8307,6 +8318,17 @@
         </w:rPr>
         <w:t>[2] A. Stetco et al., "Machine learning methods for wind turbine condition monitoring: A review," Renewable Energy, vol. 133, pp. 620-635, 2019.</w:t>
       </w:r>
+      <w:hyperlink r:id="rId43">
+        <w:r>
+          <w:rPr>
+            <w:rFonts w:ascii="Times New Roman" w:hAnsi="Times New Roman"/>
+            <w:sz w:val="15"/>
+            <w:color w:val="1155CC"/>
+            <w:u w:val="single"/>
+          </w:rPr>
+          <w:t xml:space="preserve"> https://doi.org/10.1016/j.renene.2018.10.047</w:t>
+        </w:r>
+      </w:hyperlink>
     </w:p>
     <w:p>
       <w:pPr>
@@ -8321,8 +8343,19 @@
           <w:sz w:val="15"/>
           <w:u w:val="none"/>
         </w:rPr>
-        <w:t>[3] F. P. G. de Jong, W. J. C. Verhagen, "A review of predictive maintenance for wind turbines using ML techniques," Energy Reports, vol. 8, pp. 5738-5768, 2022.</w:t>
+        <w:t>[3] T. Chen, C. Guestrin, "XGBoost: A scalable tree boosting system," Proc. 22nd ACM SIGKDD, pp. 785-794, 2016.</w:t>
       </w:r>
+      <w:hyperlink r:id="rId44">
+        <w:r>
+          <w:rPr>
+            <w:rFonts w:ascii="Times New Roman" w:hAnsi="Times New Roman"/>
+            <w:sz w:val="15"/>
+            <w:color w:val="1155CC"/>
+            <w:u w:val="single"/>
+          </w:rPr>
+          <w:t xml:space="preserve"> https://dl.acm.org/doi/10.1145/2939672.2939785</w:t>
+        </w:r>
+      </w:hyperlink>
     </w:p>
     <w:p>
       <w:pPr>
@@ -8337,8 +8370,19 @@
           <w:sz w:val="15"/>
           <w:u w:val="none"/>
         </w:rPr>
-        <w:t>[4] T. Chen, C. Guestrin, "XGBoost: A scalable tree boosting system," Proc. 22nd ACM SIGKDD, pp. 785-794, 2016.</w:t>
+        <w:t>[4] G. Ke et al., "LightGBM: A highly efficient gradient boosting decision tree," NeurIPS, vol. 30, pp. 3146-3154, 2017.</w:t>
       </w:r>
+      <w:hyperlink r:id="rId45">
+        <w:r>
+          <w:rPr>
+            <w:rFonts w:ascii="Times New Roman" w:hAnsi="Times New Roman"/>
+            <w:sz w:val="15"/>
+            <w:color w:val="1155CC"/>
+            <w:u w:val="single"/>
+          </w:rPr>
+          <w:t xml:space="preserve"> https://papers.nips.cc/paper/6907-lightgbm</w:t>
+        </w:r>
+      </w:hyperlink>
     </w:p>
     <w:p>
       <w:pPr>
@@ -8353,8 +8397,19 @@
           <w:sz w:val="15"/>
           <w:u w:val="none"/>
         </w:rPr>
-        <w:t>[5] G. Ke et al., "LightGBM: A highly efficient gradient boosting decision tree," NeurIPS, vol. 30, pp. 3146-3154, 2017.</w:t>
+        <w:t>[5] F. T. Liu, K. M. Ting, Z.-H. Zhou, "Isolation forest," Proc. IEEE ICDM, pp. 413-422, 2008.</w:t>
       </w:r>
+      <w:hyperlink r:id="rId46">
+        <w:r>
+          <w:rPr>
+            <w:rFonts w:ascii="Times New Roman" w:hAnsi="Times New Roman"/>
+            <w:sz w:val="15"/>
+            <w:color w:val="1155CC"/>
+            <w:u w:val="single"/>
+          </w:rPr>
+          <w:t xml:space="preserve"> https://ieeexplore.ieee.org/document/4781136</w:t>
+        </w:r>
+      </w:hyperlink>
     </w:p>
     <w:p>
       <w:pPr>
@@ -8369,8 +8424,19 @@
           <w:sz w:val="15"/>
           <w:u w:val="none"/>
         </w:rPr>
-        <w:t>[6] F. T. Liu, K. M. Ting, Z.-H. Zhou, "Isolation forest," Proc. IEEE ICDM, pp. 413-422, 2008.</w:t>
+        <w:t>[6] B. Scholkopf et al., "Estimating the support of a high-dimensional distribution," Neural Computation, vol. 13, no. 7, pp. 1443-1471, 2001.</w:t>
       </w:r>
+      <w:hyperlink r:id="rId47">
+        <w:r>
+          <w:rPr>
+            <w:rFonts w:ascii="Times New Roman" w:hAnsi="Times New Roman"/>
+            <w:sz w:val="15"/>
+            <w:color w:val="1155CC"/>
+            <w:u w:val="single"/>
+          </w:rPr>
+          <w:t xml:space="preserve"> https://doi.org/10.1162/089976601750264965</w:t>
+        </w:r>
+      </w:hyperlink>
     </w:p>
     <w:p>
       <w:pPr>
@@ -8385,8 +8451,19 @@
           <w:sz w:val="15"/>
           <w:u w:val="none"/>
         </w:rPr>
-        <w:t>[7] B. Scholkopf et al., "Estimating the support of a high-dimensional distribution," Neural Computation, vol. 13, no. 7, pp. 1443-1471, 2001.</w:t>
+        <w:t>[7] M. M. Breunig et al., "LOF: Identifying density-based local outliers," Proc. ACM SIGMOD, pp. 93-104, 2000.</w:t>
       </w:r>
+      <w:hyperlink r:id="rId48">
+        <w:r>
+          <w:rPr>
+            <w:rFonts w:ascii="Times New Roman" w:hAnsi="Times New Roman"/>
+            <w:sz w:val="15"/>
+            <w:color w:val="1155CC"/>
+            <w:u w:val="single"/>
+          </w:rPr>
+          <w:t xml:space="preserve"> https://dl.acm.org/doi/10.1145/335191.335388</w:t>
+        </w:r>
+      </w:hyperlink>
     </w:p>
     <w:p>
       <w:pPr>
@@ -8401,8 +8478,19 @@
           <w:sz w:val="15"/>
           <w:u w:val="none"/>
         </w:rPr>
-        <w:t>[8] M. M. Breunig et al., "LOF: Identifying density-based local outliers," Proc. ACM SIGMOD, pp. 93-104, 2000.</w:t>
+        <w:t>[8] S. Hochreiter, J. Schmidhuber, "Long short-term memory," Neural Computation, vol. 9, no. 8, pp. 1735-1780, 1997.</w:t>
       </w:r>
+      <w:hyperlink r:id="rId49">
+        <w:r>
+          <w:rPr>
+            <w:rFonts w:ascii="Times New Roman" w:hAnsi="Times New Roman"/>
+            <w:sz w:val="15"/>
+            <w:color w:val="1155CC"/>
+            <w:u w:val="single"/>
+          </w:rPr>
+          <w:t xml:space="preserve"> https://doi.org/10.1162/neco.1997.9.8.1735</w:t>
+        </w:r>
+      </w:hyperlink>
     </w:p>
     <w:p>
       <w:pPr>
@@ -8417,8 +8505,19 @@
           <w:sz w:val="15"/>
           <w:u w:val="none"/>
         </w:rPr>
-        <w:t>[9] S. Hochreiter, J. Schmidhuber, "Long short-term memory," Neural Computation, vol. 9, no. 8, pp. 1735-1780, 1997.</w:t>
+        <w:t>[9] S. Bai, J. Z. Kolter, V. Koltun, "An empirical evaluation of generic convolutional and recurrent networks for sequence modeling," arXiv:1803.01271, 2018.</w:t>
       </w:r>
+      <w:hyperlink r:id="rId50">
+        <w:r>
+          <w:rPr>
+            <w:rFonts w:ascii="Times New Roman" w:hAnsi="Times New Roman"/>
+            <w:sz w:val="15"/>
+            <w:color w:val="1155CC"/>
+            <w:u w:val="single"/>
+          </w:rPr>
+          <w:t xml:space="preserve"> https://arxiv.org/abs/1803.01271</w:t>
+        </w:r>
+      </w:hyperlink>
     </w:p>
     <w:p>
       <w:pPr>
@@ -8433,8 +8532,19 @@
           <w:sz w:val="15"/>
           <w:u w:val="none"/>
         </w:rPr>
-        <w:t>[10] S. Bai, J. Z. Kolter, V. Koltun, "An empirical evaluation of generic convolutional and recurrent networks for sequence modeling," arXiv:1803.01271, 2018.</w:t>
+        <w:t>[10] A. Vaswani et al., "Attention is all you need," NeurIPS, vol. 30, pp. 5998-6008, 2017.</w:t>
       </w:r>
+      <w:hyperlink r:id="rId51">
+        <w:r>
+          <w:rPr>
+            <w:rFonts w:ascii="Times New Roman" w:hAnsi="Times New Roman"/>
+            <w:sz w:val="15"/>
+            <w:color w:val="1155CC"/>
+            <w:u w:val="single"/>
+          </w:rPr>
+          <w:t xml:space="preserve"> https://papers.nips.cc/paper/7181-attention-is-all-you-need</w:t>
+        </w:r>
+      </w:hyperlink>
     </w:p>
     <w:p>
       <w:pPr>
@@ -8449,8 +8559,19 @@
           <w:sz w:val="15"/>
           <w:u w:val="none"/>
         </w:rPr>
-        <w:t>[11] A. Vaswani et al., "Attention is all you need," NeurIPS, vol. 30, pp. 5998-6008, 2017.</w:t>
+        <w:t>[11] S. M. Lundberg, S.-L. Lee, "A unified approach to interpreting model predictions," NeurIPS, vol. 30, pp. 4765-4774, 2017.</w:t>
       </w:r>
+      <w:hyperlink r:id="rId52">
+        <w:r>
+          <w:rPr>
+            <w:rFonts w:ascii="Times New Roman" w:hAnsi="Times New Roman"/>
+            <w:sz w:val="15"/>
+            <w:color w:val="1155CC"/>
+            <w:u w:val="single"/>
+          </w:rPr>
+          <w:t xml:space="preserve"> https://papers.nips.cc/paper/7062-a-unified-approach-to-interpreting-model-predictions</w:t>
+        </w:r>
+      </w:hyperlink>
     </w:p>
     <w:p>
       <w:pPr>
@@ -8465,8 +8586,19 @@
           <w:sz w:val="15"/>
           <w:u w:val="none"/>
         </w:rPr>
-        <w:t>[12] S. M. Lundberg, S.-I. Lee, "A unified approach to interpreting model predictions," NeurIPS, vol. 30, pp. 4765-4774, 2017.</w:t>
+        <w:t>[12] M. T. Ribeiro, S. Singh, C. Guestrin, "Why should I trust you? Explaining the predictions of any classifier," Proc. 22nd ACM SIGKDD, pp. 1135-1144, 2016.</w:t>
       </w:r>
+      <w:hyperlink r:id="rId53">
+        <w:r>
+          <w:rPr>
+            <w:rFonts w:ascii="Times New Roman" w:hAnsi="Times New Roman"/>
+            <w:sz w:val="15"/>
+            <w:color w:val="1155CC"/>
+            <w:u w:val="single"/>
+          </w:rPr>
+          <w:t xml:space="preserve"> https://dl.acm.org/doi/10.1145/2939672.2939778</w:t>
+        </w:r>
+      </w:hyperlink>
     </w:p>
     <w:p>
       <w:pPr>
@@ -8481,8 +8613,19 @@
           <w:sz w:val="15"/>
           <w:u w:val="none"/>
         </w:rPr>
-        <w:t>[13] M. T. Ribeiro, S. Singh, C. Guestrin, "Why should I trust you? Explaining the predictions of any classifier," Proc. 22nd ACM SIGKDD, pp. 1135-1144, 2016.</w:t>
+        <w:t>[13] N. V. Chawla et al., "SMOTE: Synthetic minority over-sampling technique," JAIR, vol. 16, pp. 321-357, 2002.</w:t>
       </w:r>
+      <w:hyperlink r:id="rId54">
+        <w:r>
+          <w:rPr>
+            <w:rFonts w:ascii="Times New Roman" w:hAnsi="Times New Roman"/>
+            <w:sz w:val="15"/>
+            <w:color w:val="1155CC"/>
+            <w:u w:val="single"/>
+          </w:rPr>
+          <w:t xml:space="preserve"> https://doi.org/10.1613/jair.953</w:t>
+        </w:r>
+      </w:hyperlink>
     </w:p>
     <w:p>
       <w:pPr>
@@ -8497,8 +8640,19 @@
           <w:sz w:val="15"/>
           <w:u w:val="none"/>
         </w:rPr>
-        <w:t>[14] N. V. Chawla et al., "SMOTE: Synthetic minority over-sampling technique," JAIR, vol. 16, pp. 321-357, 2002.</w:t>
+        <w:t>[14] W. Qiao, D. Lu, "A survey on wind turbine condition monitoring and fault diagnosis," IEEE Trans. Ind. Electron., vol. 62, no. 10, pp. 6536-6545, 2015.</w:t>
       </w:r>
+      <w:hyperlink r:id="rId55">
+        <w:r>
+          <w:rPr>
+            <w:rFonts w:ascii="Times New Roman" w:hAnsi="Times New Roman"/>
+            <w:sz w:val="15"/>
+            <w:color w:val="1155CC"/>
+            <w:u w:val="single"/>
+          </w:rPr>
+          <w:t xml:space="preserve"> https://ieeexplore.ieee.org/document/7084135</w:t>
+        </w:r>
+      </w:hyperlink>
     </w:p>
     <w:p>
       <w:pPr>
@@ -8513,8 +8667,19 @@
           <w:sz w:val="15"/>
           <w:u w:val="none"/>
         </w:rPr>
-        <w:t>[15] W. Qiao, D. Lu, "A survey on wind turbine condition monitoring and fault diagnosis," IEEE Trans. Ind. Electron., vol. 62, no. 10, pp. 6536-6545, 2015.</w:t>
+        <w:t>[15] K. Cho et al., "Learning phrase representations using RNN encoder-decoder," Proc. EMNLP, pp. 1724-1734, 2014.</w:t>
       </w:r>
+      <w:hyperlink r:id="rId56">
+        <w:r>
+          <w:rPr>
+            <w:rFonts w:ascii="Times New Roman" w:hAnsi="Times New Roman"/>
+            <w:sz w:val="15"/>
+            <w:color w:val="1155CC"/>
+            <w:u w:val="single"/>
+          </w:rPr>
+          <w:t xml:space="preserve"> https://aclanthology.org/D14-1179/</w:t>
+        </w:r>
+      </w:hyperlink>
     </w:p>
     <w:p>
       <w:pPr>
@@ -8529,8 +8694,19 @@
           <w:sz w:val="15"/>
           <w:u w:val="none"/>
         </w:rPr>
-        <w:t>[16] K. Cho et al., "Learning phrase representations using RNN encoder-decoder," Proc. EMNLP, pp. 1724-1734, 2014.</w:t>
+        <w:t>[16] X.-S. Si et al., "Remaining useful life estimation - A review on the statistical data driven approaches," EJOR, vol. 213, no. 1, pp. 1-14, 2011.</w:t>
       </w:r>
+      <w:hyperlink r:id="rId57">
+        <w:r>
+          <w:rPr>
+            <w:rFonts w:ascii="Times New Roman" w:hAnsi="Times New Roman"/>
+            <w:sz w:val="15"/>
+            <w:color w:val="1155CC"/>
+            <w:u w:val="single"/>
+          </w:rPr>
+          <w:t xml:space="preserve"> https://doi.org/10.1016/j.ejor.2010.11.018</w:t>
+        </w:r>
+      </w:hyperlink>
     </w:p>
     <w:p>
       <w:pPr>
@@ -8545,8 +8721,19 @@
           <w:sz w:val="15"/>
           <w:u w:val="none"/>
         </w:rPr>
-        <w:t>[17] X.-S. Si et al., "Remaining useful life estimation - A review on the statistical data driven approaches," EJOR, vol. 213, no. 1, pp. 1-14, 2011.</w:t>
+        <w:t>[17] L. Breiman, "Random forests," Machine Learning, vol. 45, no. 1, pp. 5-32, 2001.</w:t>
       </w:r>
+      <w:hyperlink r:id="rId58">
+        <w:r>
+          <w:rPr>
+            <w:rFonts w:ascii="Times New Roman" w:hAnsi="Times New Roman"/>
+            <w:sz w:val="15"/>
+            <w:color w:val="1155CC"/>
+            <w:u w:val="single"/>
+          </w:rPr>
+          <w:t xml:space="preserve"> https://doi.org/10.1023/A:1010933404324</w:t>
+        </w:r>
+      </w:hyperlink>
     </w:p>
     <w:p>
       <w:pPr>
@@ -8561,8 +8748,19 @@
           <w:sz w:val="15"/>
           <w:u w:val="none"/>
         </w:rPr>
-        <w:t>[18] L. Breiman, "Random forests," Machine Learning, vol. 45, no. 1, pp. 5-32, 2001.</w:t>
+        <w:t>[18] D. E. Rumelhart, G. E. Hinton, R. J. Williams, "Learning representations by back-propagating errors," Nature, vol. 323, pp. 533-536, 1986.</w:t>
       </w:r>
+      <w:hyperlink r:id="rId59">
+        <w:r>
+          <w:rPr>
+            <w:rFonts w:ascii="Times New Roman" w:hAnsi="Times New Roman"/>
+            <w:sz w:val="15"/>
+            <w:color w:val="1155CC"/>
+            <w:u w:val="single"/>
+          </w:rPr>
+          <w:t xml:space="preserve"> https://doi.org/10.1038/323533a0</w:t>
+        </w:r>
+      </w:hyperlink>
     </w:p>
     <w:p>
       <w:pPr>
@@ -8577,24 +8775,19 @@
           <w:sz w:val="15"/>
           <w:u w:val="none"/>
         </w:rPr>
-        <w:t>[19] D. E. Rumelhart, G. E. Hinton, R. J. Williams, "Learning representations by back-propagating errors," Nature, vol. 323, pp. 533-536, 1986.</w:t>
+        <w:t>[19] J. Macqueen, "Some methods for classification and analysis of multivariate observations," Proc. 5th Berkeley Symp., pp. 281-297, 1967.</w:t>
       </w:r>
-    </w:p>
-    <w:p>
-      <w:pPr>
-        <w:spacing w:after="20"/>
-        <w:ind w:left="227" w:hanging="227"/>
-        <w:jc w:val="both"/>
-      </w:pPr>
-      <w:r>
-        <w:rPr>
-          <w:rFonts w:ascii="Times New Roman" w:hAnsi="Times New Roman"/>
-          <w:color w:val="000000"/>
-          <w:sz w:val="15"/>
-          <w:u w:val="none"/>
-        </w:rPr>
-        <w:t>[20] J. Macqueen, "Some methods for classification and analysis of multivariate observations," Proc. 5th Berkeley Symp., pp. 281-297, 1967.</w:t>
-      </w:r>
+      <w:hyperlink r:id="rId60">
+        <w:r>
+          <w:rPr>
+            <w:rFonts w:ascii="Times New Roman" w:hAnsi="Times New Roman"/>
+            <w:sz w:val="15"/>
+            <w:color w:val="1155CC"/>
+            <w:u w:val="single"/>
+          </w:rPr>
+          <w:t xml:space="preserve"> https://projecteuclid.org/euclid.bsmsp/1200512992</w:t>
+        </w:r>
+      </w:hyperlink>
     </w:p>
     <w:sectPr>
       <w:type w:val="continuous"/>

</xml_diff>